<commit_message>
docs: 修掉 docx 里的 ** 残留 + 换新 S03
转换器根本不会解析行内 markdown，导致 Word 里出现 **加粗** 这样的原始符号：
软件说明书 70 处、用户手册 120 处、8 份过程材料共 18 处起。

- gen-process-docs.py 新增 add_runs()：**粗体** → 粗体，\代码\ → 等宽
- 段落 / 列表 / 表格单元格全部走它
- 11 份 docx 重新生成，** 残留归零
  （源代码-提交版.docx 里的 ** 是 JS 幂运算符，不动）

S03 换成新截的连接设置（无红字、Key 显示「已保存」、右侧为完成态）。

.gitignore 补 表情包.png
</commit_message>
<xml_diff>
--- a/docs/用户手册.docx
+++ b/docs/用户手册.docx
@@ -169,7 +169,23 @@
           <w:b w:val="0"/>
           <w:sz w:val="21"/>
         </w:rPr>
-        <w:t>这份手册会以 **PDF** 形式放在软件文件夹里，随时可以打开看。</w:t>
+        <w:t xml:space="preserve">这份手册会以 </w:t>
+      </w:r>
+      <w:r>
+        <w:rPr>
+          <w:rFonts w:ascii="Times New Roman" w:hAnsi="Times New Roman" w:eastAsia="宋体"/>
+          <w:b/>
+          <w:sz w:val="21"/>
+        </w:rPr>
+        <w:t>PDF</w:t>
+      </w:r>
+      <w:r>
+        <w:rPr>
+          <w:rFonts w:ascii="Times New Roman" w:hAnsi="Times New Roman" w:eastAsia="宋体"/>
+          <w:b w:val="0"/>
+          <w:sz w:val="21"/>
+        </w:rPr>
+        <w:t xml:space="preserve"> 形式放在软件文件夹里，随时可以打开看。</w:t>
       </w:r>
     </w:p>
     <w:p>
@@ -212,7 +228,23 @@
           <w:b w:val="0"/>
           <w:sz w:val="21"/>
         </w:rPr>
-        <w:t>把一道物理题（文字或拍照）变成**能动、能量化讲**的动画，再导出成网页或 GIF。</w:t>
+        <w:t>把一道物理题（文字或拍照）变成</w:t>
+      </w:r>
+      <w:r>
+        <w:rPr>
+          <w:rFonts w:ascii="Times New Roman" w:hAnsi="Times New Roman" w:eastAsia="宋体"/>
+          <w:b/>
+          <w:sz w:val="21"/>
+        </w:rPr>
+        <w:t>能动、能量化讲</w:t>
+      </w:r>
+      <w:r>
+        <w:rPr>
+          <w:rFonts w:ascii="Times New Roman" w:hAnsi="Times New Roman" w:eastAsia="宋体"/>
+          <w:b w:val="0"/>
+          <w:sz w:val="21"/>
+        </w:rPr>
+        <w:t>的动画，再导出成网页或 GIF。</w:t>
       </w:r>
     </w:p>
     <w:p>
@@ -226,7 +258,23 @@
           <w:b w:val="0"/>
           <w:sz w:val="21"/>
         </w:rPr>
-        <w:t>给**中学物理老师**用；</w:t>
+        <w:t>给</w:t>
+      </w:r>
+      <w:r>
+        <w:rPr>
+          <w:rFonts w:ascii="Times New Roman" w:hAnsi="Times New Roman" w:eastAsia="宋体"/>
+          <w:b/>
+          <w:sz w:val="21"/>
+        </w:rPr>
+        <w:t>中学物理老师</w:t>
+      </w:r>
+      <w:r>
+        <w:rPr>
+          <w:rFonts w:ascii="Times New Roman" w:hAnsi="Times New Roman" w:eastAsia="宋体"/>
+          <w:b w:val="0"/>
+          <w:sz w:val="21"/>
+        </w:rPr>
+        <w:t>用；</w:t>
       </w:r>
     </w:p>
     <w:p>
@@ -237,10 +285,18 @@
       <w:r>
         <w:rPr>
           <w:rFonts w:ascii="Times New Roman" w:hAnsi="Times New Roman" w:eastAsia="宋体"/>
+          <w:b/>
+          <w:sz w:val="21"/>
+        </w:rPr>
+        <w:t>全程在本机跑</w:t>
+      </w:r>
+      <w:r>
+        <w:rPr>
+          <w:rFonts w:ascii="Times New Roman" w:hAnsi="Times New Roman" w:eastAsia="宋体"/>
           <w:b w:val="0"/>
           <w:sz w:val="21"/>
         </w:rPr>
-        <w:t>**全程在本机跑**，题目和密钥不上传；</w:t>
+        <w:t>，题目和密钥不上传；</w:t>
       </w:r>
     </w:p>
     <w:p>
@@ -314,7 +370,23 @@
           <w:b w:val="0"/>
           <w:sz w:val="21"/>
         </w:rPr>
-        <w:t>双击 `小肥鱼物理解题动画-Setup-x.y.z.exe`；</w:t>
+        <w:t xml:space="preserve">双击 </w:t>
+      </w:r>
+      <w:r>
+        <w:rPr>
+          <w:rFonts w:ascii="Courier New" w:hAnsi="Courier New" w:eastAsia="宋体"/>
+          <w:b w:val="0"/>
+          <w:sz w:val="21"/>
+        </w:rPr>
+        <w:t>小肥鱼物理解题动画-Setup-x.y.z.exe</w:t>
+      </w:r>
+      <w:r>
+        <w:rPr>
+          <w:rFonts w:ascii="Times New Roman" w:hAnsi="Times New Roman" w:eastAsia="宋体"/>
+          <w:b w:val="0"/>
+          <w:sz w:val="21"/>
+        </w:rPr>
+        <w:t>；</w:t>
       </w:r>
     </w:p>
     <w:p>
@@ -328,7 +400,23 @@
           <w:b w:val="0"/>
           <w:sz w:val="21"/>
         </w:rPr>
-        <w:t>选安装目录（默认在用户目录下，**不需要管理员权限**）；</w:t>
+        <w:t>选安装目录（默认在用户目录下，</w:t>
+      </w:r>
+      <w:r>
+        <w:rPr>
+          <w:rFonts w:ascii="Times New Roman" w:hAnsi="Times New Roman" w:eastAsia="宋体"/>
+          <w:b/>
+          <w:sz w:val="21"/>
+        </w:rPr>
+        <w:t>不需要管理员权限</w:t>
+      </w:r>
+      <w:r>
+        <w:rPr>
+          <w:rFonts w:ascii="Times New Roman" w:hAnsi="Times New Roman" w:eastAsia="宋体"/>
+          <w:b w:val="0"/>
+          <w:sz w:val="21"/>
+        </w:rPr>
+        <w:t>）；</w:t>
       </w:r>
     </w:p>
     <w:p>
@@ -389,7 +477,23 @@
           <w:b w:val="0"/>
           <w:sz w:val="21"/>
         </w:rPr>
-        <w:t>解压 zip 到任意文件夹，双击 `小肥鱼物理解题动画.exe` 即可，不写系统目录。</w:t>
+        <w:t xml:space="preserve">解压 zip 到任意文件夹，双击 </w:t>
+      </w:r>
+      <w:r>
+        <w:rPr>
+          <w:rFonts w:ascii="Courier New" w:hAnsi="Courier New" w:eastAsia="宋体"/>
+          <w:b w:val="0"/>
+          <w:sz w:val="21"/>
+        </w:rPr>
+        <w:t>小肥鱼物理解题动画.exe</w:t>
+      </w:r>
+      <w:r>
+        <w:rPr>
+          <w:rFonts w:ascii="Times New Roman" w:hAnsi="Times New Roman" w:eastAsia="宋体"/>
+          <w:b w:val="0"/>
+          <w:sz w:val="21"/>
+        </w:rPr>
+        <w:t xml:space="preserve"> 即可，不写系统目录。</w:t>
       </w:r>
     </w:p>
     <w:p>
@@ -399,7 +503,39 @@
           <w:b w:val="0"/>
           <w:sz w:val="21"/>
         </w:rPr>
-        <w:t>建议放在**不含空格和特殊字符**的路径下，例如 `D:\物理动画\`。</w:t>
+        <w:t>建议放在</w:t>
+      </w:r>
+      <w:r>
+        <w:rPr>
+          <w:rFonts w:ascii="Times New Roman" w:hAnsi="Times New Roman" w:eastAsia="宋体"/>
+          <w:b/>
+          <w:sz w:val="21"/>
+        </w:rPr>
+        <w:t>不含空格和特殊字符</w:t>
+      </w:r>
+      <w:r>
+        <w:rPr>
+          <w:rFonts w:ascii="Times New Roman" w:hAnsi="Times New Roman" w:eastAsia="宋体"/>
+          <w:b w:val="0"/>
+          <w:sz w:val="21"/>
+        </w:rPr>
+        <w:t xml:space="preserve">的路径下，例如 </w:t>
+      </w:r>
+      <w:r>
+        <w:rPr>
+          <w:rFonts w:ascii="Courier New" w:hAnsi="Courier New" w:eastAsia="宋体"/>
+          <w:b w:val="0"/>
+          <w:sz w:val="21"/>
+        </w:rPr>
+        <w:t>D:\物理动画\</w:t>
+      </w:r>
+      <w:r>
+        <w:rPr>
+          <w:rFonts w:ascii="Times New Roman" w:hAnsi="Times New Roman" w:eastAsia="宋体"/>
+          <w:b w:val="0"/>
+          <w:sz w:val="21"/>
+        </w:rPr>
+        <w:t>。</w:t>
       </w:r>
     </w:p>
     <w:p>
@@ -497,7 +633,15 @@
           <w:b w:val="0"/>
           <w:sz w:val="21"/>
         </w:rPr>
-        <w:t>⚠ **没有密钥，跑不了自己的题。**</w:t>
+        <w:t xml:space="preserve">⚠ </w:t>
+      </w:r>
+      <w:r>
+        <w:rPr>
+          <w:rFonts w:ascii="Times New Roman" w:hAnsi="Times New Roman" w:eastAsia="宋体"/>
+          <w:b/>
+          <w:sz w:val="21"/>
+        </w:rPr>
+        <w:t>没有密钥，跑不了自己的题。</w:t>
       </w:r>
     </w:p>
     <w:p>
@@ -507,7 +651,23 @@
           <w:b w:val="0"/>
           <w:sz w:val="21"/>
         </w:rPr>
-        <w:t>软件本身**不自带模型**，所有生成都由你自己配置的接口完成。</w:t>
+        <w:t>软件本身</w:t>
+      </w:r>
+      <w:r>
+        <w:rPr>
+          <w:rFonts w:ascii="Times New Roman" w:hAnsi="Times New Roman" w:eastAsia="宋体"/>
+          <w:b/>
+          <w:sz w:val="21"/>
+        </w:rPr>
+        <w:t>不自带模型</w:t>
+      </w:r>
+      <w:r>
+        <w:rPr>
+          <w:rFonts w:ascii="Times New Roman" w:hAnsi="Times New Roman" w:eastAsia="宋体"/>
+          <w:b w:val="0"/>
+          <w:sz w:val="21"/>
+        </w:rPr>
+        <w:t>，所有生成都由你自己配置的接口完成。</w:t>
       </w:r>
     </w:p>
     <w:p>
@@ -594,10 +754,10 @@
             <w:r>
               <w:rPr>
                 <w:rFonts w:ascii="Times New Roman" w:hAnsi="Times New Roman" w:eastAsia="宋体"/>
-                <w:b w:val="0"/>
+                <w:b/>
                 <w:sz w:val="19"/>
               </w:rPr>
-              <w:t>**DeepSeek 官方**</w:t>
+              <w:t>DeepSeek 官方</w:t>
             </w:r>
           </w:p>
         </w:tc>
@@ -644,10 +804,18 @@
             <w:r>
               <w:rPr>
                 <w:rFonts w:ascii="Times New Roman" w:hAnsi="Times New Roman" w:eastAsia="宋体"/>
+                <w:b/>
+                <w:sz w:val="19"/>
+              </w:rPr>
+              <w:t>国内云平台</w:t>
+            </w:r>
+            <w:r>
+              <w:rPr>
+                <w:rFonts w:ascii="Times New Roman" w:hAnsi="Times New Roman" w:eastAsia="宋体"/>
                 <w:b w:val="0"/>
                 <w:sz w:val="19"/>
               </w:rPr>
-              <w:t>**国内云平台**（通义 / 豆包 / 智谱 / 月之暗面等）</w:t>
+              <w:t>（通义 / 豆包 / 智谱 / 月之暗面等）</w:t>
             </w:r>
           </w:p>
         </w:tc>
@@ -694,10 +862,18 @@
             <w:r>
               <w:rPr>
                 <w:rFonts w:ascii="Times New Roman" w:hAnsi="Times New Roman" w:eastAsia="宋体"/>
+                <w:b/>
+                <w:sz w:val="19"/>
+              </w:rPr>
+              <w:t>本地模型</w:t>
+            </w:r>
+            <w:r>
+              <w:rPr>
+                <w:rFonts w:ascii="Times New Roman" w:hAnsi="Times New Roman" w:eastAsia="宋体"/>
                 <w:b w:val="0"/>
                 <w:sz w:val="19"/>
               </w:rPr>
-              <w:t>**本地模型**（Ollama 等）</w:t>
+              <w:t>（Ollama 等）</w:t>
             </w:r>
           </w:p>
         </w:tc>
@@ -739,10 +915,18 @@
       <w:r>
         <w:rPr>
           <w:rFonts w:ascii="Times New Roman" w:hAnsi="Times New Roman" w:eastAsia="宋体"/>
+          <w:b/>
+          <w:sz w:val="21"/>
+        </w:rPr>
+        <w:t>拍照题必须选“支持看图”的模型。</w:t>
+      </w:r>
+      <w:r>
+        <w:rPr>
+          <w:rFonts w:ascii="Times New Roman" w:hAnsi="Times New Roman" w:eastAsia="宋体"/>
           <w:b w:val="0"/>
           <w:sz w:val="21"/>
         </w:rPr>
-        <w:t>**拍照题必须选“支持看图”的模型。** 纯文本模型传图片会直接报错（软件会提示「不支持看图」）。</w:t>
+        <w:t xml:space="preserve"> 纯文本模型传图片会直接报错（软件会提示「不支持看图」）。</w:t>
       </w:r>
     </w:p>
     <w:p>
@@ -762,10 +946,34 @@
       <w:r>
         <w:rPr>
           <w:rFonts w:ascii="Times New Roman" w:hAnsi="Times New Roman" w:eastAsia="宋体"/>
+          <w:b/>
+          <w:sz w:val="21"/>
+        </w:rPr>
+        <w:t>第 1 步｜打开官网。</w:t>
+      </w:r>
+      <w:r>
+        <w:rPr>
+          <w:rFonts w:ascii="Times New Roman" w:hAnsi="Times New Roman" w:eastAsia="宋体"/>
           <w:b w:val="0"/>
           <w:sz w:val="21"/>
         </w:rPr>
-        <w:t>**第 1 步｜打开官网。** 在浏览器地址栏输入 `deepseek.com`，回车。</w:t>
+        <w:t xml:space="preserve"> 在浏览器地址栏输入 </w:t>
+      </w:r>
+      <w:r>
+        <w:rPr>
+          <w:rFonts w:ascii="Courier New" w:hAnsi="Courier New" w:eastAsia="宋体"/>
+          <w:b w:val="0"/>
+          <w:sz w:val="21"/>
+        </w:rPr>
+        <w:t>deepseek.com</w:t>
+      </w:r>
+      <w:r>
+        <w:rPr>
+          <w:rFonts w:ascii="Times New Roman" w:hAnsi="Times New Roman" w:eastAsia="宋体"/>
+          <w:b w:val="0"/>
+          <w:sz w:val="21"/>
+        </w:rPr>
+        <w:t>，回车。</w:t>
       </w:r>
     </w:p>
     <w:p>
@@ -827,10 +1035,34 @@
       <w:r>
         <w:rPr>
           <w:rFonts w:ascii="Times New Roman" w:hAnsi="Times New Roman" w:eastAsia="宋体"/>
+          <w:b/>
+          <w:sz w:val="21"/>
+        </w:rPr>
+        <w:t>第 2 步｜登录开放平台。</w:t>
+      </w:r>
+      <w:r>
+        <w:rPr>
+          <w:rFonts w:ascii="Times New Roman" w:hAnsi="Times New Roman" w:eastAsia="宋体"/>
           <w:b w:val="0"/>
           <w:sz w:val="21"/>
         </w:rPr>
-        <w:t>**第 2 步｜登录开放平台。** 进到 `platform.deepseek.com` 后，用手机号 + 验证码登录，</w:t>
+        <w:t xml:space="preserve"> 进到 </w:t>
+      </w:r>
+      <w:r>
+        <w:rPr>
+          <w:rFonts w:ascii="Courier New" w:hAnsi="Courier New" w:eastAsia="宋体"/>
+          <w:b w:val="0"/>
+          <w:sz w:val="21"/>
+        </w:rPr>
+        <w:t>platform.deepseek.com</w:t>
+      </w:r>
+      <w:r>
+        <w:rPr>
+          <w:rFonts w:ascii="Times New Roman" w:hAnsi="Times New Roman" w:eastAsia="宋体"/>
+          <w:b w:val="0"/>
+          <w:sz w:val="21"/>
+        </w:rPr>
+        <w:t xml:space="preserve"> 后，用手机号 + 验证码登录，</w:t>
       </w:r>
     </w:p>
     <w:p>
@@ -840,7 +1072,15 @@
           <w:b w:val="0"/>
           <w:sz w:val="21"/>
         </w:rPr>
-        <w:t>或者直接微信扫码（右侧二维码）。**没注册过的手机号会自动注册。**</w:t>
+        <w:t>或者直接微信扫码（右侧二维码）。</w:t>
+      </w:r>
+      <w:r>
+        <w:rPr>
+          <w:rFonts w:ascii="Times New Roman" w:hAnsi="Times New Roman" w:eastAsia="宋体"/>
+          <w:b/>
+          <w:sz w:val="21"/>
+        </w:rPr>
+        <w:t>没注册过的手机号会自动注册。</w:t>
       </w:r>
     </w:p>
     <w:p>
@@ -902,10 +1142,50 @@
       <w:r>
         <w:rPr>
           <w:rFonts w:ascii="Times New Roman" w:hAnsi="Times New Roman" w:eastAsia="宋体"/>
+          <w:b/>
+          <w:sz w:val="21"/>
+        </w:rPr>
+        <w:t>第 3 步｜创建 API key。</w:t>
+      </w:r>
+      <w:r>
+        <w:rPr>
+          <w:rFonts w:ascii="Times New Roman" w:hAnsi="Times New Roman" w:eastAsia="宋体"/>
           <w:b w:val="0"/>
           <w:sz w:val="21"/>
         </w:rPr>
-        <w:t>**第 3 步｜创建 API key。** 左侧菜单点 **API keys**，右上角点 **创建 API key**。</w:t>
+        <w:t xml:space="preserve"> 左侧菜单点 </w:t>
+      </w:r>
+      <w:r>
+        <w:rPr>
+          <w:rFonts w:ascii="Times New Roman" w:hAnsi="Times New Roman" w:eastAsia="宋体"/>
+          <w:b/>
+          <w:sz w:val="21"/>
+        </w:rPr>
+        <w:t>API keys</w:t>
+      </w:r>
+      <w:r>
+        <w:rPr>
+          <w:rFonts w:ascii="Times New Roman" w:hAnsi="Times New Roman" w:eastAsia="宋体"/>
+          <w:b w:val="0"/>
+          <w:sz w:val="21"/>
+        </w:rPr>
+        <w:t xml:space="preserve">，右上角点 </w:t>
+      </w:r>
+      <w:r>
+        <w:rPr>
+          <w:rFonts w:ascii="Times New Roman" w:hAnsi="Times New Roman" w:eastAsia="宋体"/>
+          <w:b/>
+          <w:sz w:val="21"/>
+        </w:rPr>
+        <w:t>创建 API key</w:t>
+      </w:r>
+      <w:r>
+        <w:rPr>
+          <w:rFonts w:ascii="Times New Roman" w:hAnsi="Times New Roman" w:eastAsia="宋体"/>
+          <w:b w:val="0"/>
+          <w:sz w:val="21"/>
+        </w:rPr>
+        <w:t>。</w:t>
       </w:r>
     </w:p>
     <w:p>
@@ -970,7 +1250,23 @@
           <w:b w:val="0"/>
           <w:sz w:val="21"/>
         </w:rPr>
-        <w:t>⚠ **这串 `sk-...` 只显示一次。** 弹窗出来后立刻复制，关掉就再也看不到了（只能重新建一个）。</w:t>
+        <w:t xml:space="preserve">⚠ </w:t>
+      </w:r>
+      <w:r>
+        <w:rPr>
+          <w:rFonts w:ascii="Times New Roman" w:hAnsi="Times New Roman" w:eastAsia="宋体"/>
+          <w:b/>
+          <w:sz w:val="21"/>
+        </w:rPr>
+        <w:t>这串 `sk-...` 只显示一次。</w:t>
+      </w:r>
+      <w:r>
+        <w:rPr>
+          <w:rFonts w:ascii="Times New Roman" w:hAnsi="Times New Roman" w:eastAsia="宋体"/>
+          <w:b w:val="0"/>
+          <w:sz w:val="21"/>
+        </w:rPr>
+        <w:t xml:space="preserve"> 弹窗出来后立刻复制，关掉就再也看不到了（只能重新建一个）。</w:t>
       </w:r>
     </w:p>
     <w:p>
@@ -987,10 +1283,50 @@
       <w:r>
         <w:rPr>
           <w:rFonts w:ascii="Times New Roman" w:hAnsi="Times New Roman" w:eastAsia="宋体"/>
+          <w:b/>
+          <w:sz w:val="21"/>
+        </w:rPr>
+        <w:t>第 4 步｜看接口地址和模型名。</w:t>
+      </w:r>
+      <w:r>
+        <w:rPr>
+          <w:rFonts w:ascii="Times New Roman" w:hAnsi="Times New Roman" w:eastAsia="宋体"/>
           <w:b w:val="0"/>
           <w:sz w:val="21"/>
         </w:rPr>
-        <w:t>**第 4 步｜看接口地址和模型名。** 点左侧的 **接口文档**（`api-docs.deepseek.com`），</w:t>
+        <w:t xml:space="preserve"> 点左侧的 </w:t>
+      </w:r>
+      <w:r>
+        <w:rPr>
+          <w:rFonts w:ascii="Times New Roman" w:hAnsi="Times New Roman" w:eastAsia="宋体"/>
+          <w:b/>
+          <w:sz w:val="21"/>
+        </w:rPr>
+        <w:t>接口文档</w:t>
+      </w:r>
+      <w:r>
+        <w:rPr>
+          <w:rFonts w:ascii="Times New Roman" w:hAnsi="Times New Roman" w:eastAsia="宋体"/>
+          <w:b w:val="0"/>
+          <w:sz w:val="21"/>
+        </w:rPr>
+        <w:t>（</w:t>
+      </w:r>
+      <w:r>
+        <w:rPr>
+          <w:rFonts w:ascii="Courier New" w:hAnsi="Courier New" w:eastAsia="宋体"/>
+          <w:b w:val="0"/>
+          <w:sz w:val="21"/>
+        </w:rPr>
+        <w:t>api-docs.deepseek.com</w:t>
+      </w:r>
+      <w:r>
+        <w:rPr>
+          <w:rFonts w:ascii="Times New Roman" w:hAnsi="Times New Roman" w:eastAsia="宋体"/>
+          <w:b w:val="0"/>
+          <w:sz w:val="21"/>
+        </w:rPr>
+        <w:t>），</w:t>
       </w:r>
     </w:p>
     <w:p>
@@ -1062,10 +1398,10 @@
       <w:r>
         <w:rPr>
           <w:rFonts w:ascii="Times New Roman" w:hAnsi="Times New Roman" w:eastAsia="宋体"/>
-          <w:b w:val="0"/>
+          <w:b/>
           <w:sz w:val="21"/>
         </w:rPr>
-        <w:t>**第 5 步｜回软件填三项。**</w:t>
+        <w:t>第 5 步｜回软件填三项。</w:t>
       </w:r>
     </w:p>
     <w:tbl>
@@ -1137,11 +1473,35 @@
             <w:r/>
             <w:r>
               <w:rPr>
+                <w:rFonts w:ascii="Courier New" w:hAnsi="Courier New" w:eastAsia="宋体"/>
+                <w:b w:val="0"/>
+                <w:sz w:val="19"/>
+              </w:rPr>
+              <w:t>https://api.deepseek.com</w:t>
+            </w:r>
+            <w:r>
+              <w:rPr>
                 <w:rFonts w:ascii="Times New Roman" w:hAnsi="Times New Roman" w:eastAsia="宋体"/>
                 <w:b w:val="0"/>
                 <w:sz w:val="19"/>
               </w:rPr>
-              <w:t>`https://api.deepseek.com`（文档里的 `base_url (OpenAI)`）</w:t>
+              <w:t xml:space="preserve">（文档里的 </w:t>
+            </w:r>
+            <w:r>
+              <w:rPr>
+                <w:rFonts w:ascii="Courier New" w:hAnsi="Courier New" w:eastAsia="宋体"/>
+                <w:b w:val="0"/>
+                <w:sz w:val="19"/>
+              </w:rPr>
+              <w:t>base_url (OpenAI)</w:t>
+            </w:r>
+            <w:r>
+              <w:rPr>
+                <w:rFonts w:ascii="Times New Roman" w:hAnsi="Times New Roman" w:eastAsia="宋体"/>
+                <w:b w:val="0"/>
+                <w:sz w:val="19"/>
+              </w:rPr>
+              <w:t>）</w:t>
             </w:r>
           </w:p>
         </w:tc>
@@ -1171,11 +1531,27 @@
             <w:r/>
             <w:r>
               <w:rPr>
+                <w:rFonts w:ascii="Courier New" w:hAnsi="Courier New" w:eastAsia="宋体"/>
+                <w:b w:val="0"/>
+                <w:sz w:val="19"/>
+              </w:rPr>
+              <w:t>deepseek-flash</w:t>
+            </w:r>
+            <w:r>
+              <w:rPr>
                 <w:rFonts w:ascii="Times New Roman" w:hAnsi="Times New Roman" w:eastAsia="宋体"/>
                 <w:b w:val="0"/>
                 <w:sz w:val="19"/>
               </w:rPr>
-              <w:t>`deepseek-flash`（文档推荐）；也可填 `deepseek-v4-pro`</w:t>
+              <w:t xml:space="preserve">（文档推荐）；也可填 </w:t>
+            </w:r>
+            <w:r>
+              <w:rPr>
+                <w:rFonts w:ascii="Courier New" w:hAnsi="Courier New" w:eastAsia="宋体"/>
+                <w:b w:val="0"/>
+                <w:sz w:val="19"/>
+              </w:rPr>
+              <w:t>deepseek-v4-pro</w:t>
             </w:r>
           </w:p>
         </w:tc>
@@ -1209,7 +1585,15 @@
                 <w:b w:val="0"/>
                 <w:sz w:val="19"/>
               </w:rPr>
-              <w:t>第 3 步复制的 `sk-...`</w:t>
+              <w:t xml:space="preserve">第 3 步复制的 </w:t>
+            </w:r>
+            <w:r>
+              <w:rPr>
+                <w:rFonts w:ascii="Courier New" w:hAnsi="Courier New" w:eastAsia="宋体"/>
+                <w:b w:val="0"/>
+                <w:sz w:val="19"/>
+              </w:rPr>
+              <w:t>sk-...</w:t>
             </w:r>
           </w:p>
         </w:tc>
@@ -1219,10 +1603,50 @@
       <w:r>
         <w:rPr>
           <w:rFonts w:ascii="Times New Roman" w:hAnsi="Times New Roman" w:eastAsia="宋体"/>
+          <w:b/>
+          <w:sz w:val="21"/>
+        </w:rPr>
+        <w:t>模型名会变。</w:t>
+      </w:r>
+      <w:r>
+        <w:rPr>
+          <w:rFonts w:ascii="Times New Roman" w:hAnsi="Times New Roman" w:eastAsia="宋体"/>
           <w:b w:val="0"/>
           <w:sz w:val="21"/>
         </w:rPr>
-        <w:t>**模型名会变。** 官方已经改过几次命名（`deepseek-chat`、`deepseek-v4-flash` 都是旧的）。</w:t>
+        <w:t xml:space="preserve"> 官方已经改过几次命名（</w:t>
+      </w:r>
+      <w:r>
+        <w:rPr>
+          <w:rFonts w:ascii="Courier New" w:hAnsi="Courier New" w:eastAsia="宋体"/>
+          <w:b w:val="0"/>
+          <w:sz w:val="21"/>
+        </w:rPr>
+        <w:t>deepseek-chat</w:t>
+      </w:r>
+      <w:r>
+        <w:rPr>
+          <w:rFonts w:ascii="Times New Roman" w:hAnsi="Times New Roman" w:eastAsia="宋体"/>
+          <w:b w:val="0"/>
+          <w:sz w:val="21"/>
+        </w:rPr>
+        <w:t>、</w:t>
+      </w:r>
+      <w:r>
+        <w:rPr>
+          <w:rFonts w:ascii="Courier New" w:hAnsi="Courier New" w:eastAsia="宋体"/>
+          <w:b w:val="0"/>
+          <w:sz w:val="21"/>
+        </w:rPr>
+        <w:t>deepseek-v4-flash</w:t>
+      </w:r>
+      <w:r>
+        <w:rPr>
+          <w:rFonts w:ascii="Times New Roman" w:hAnsi="Times New Roman" w:eastAsia="宋体"/>
+          <w:b w:val="0"/>
+          <w:sz w:val="21"/>
+        </w:rPr>
+        <w:t xml:space="preserve"> 都是旧的）。</w:t>
       </w:r>
     </w:p>
     <w:p>
@@ -1232,7 +1656,23 @@
           <w:b w:val="0"/>
           <w:sz w:val="21"/>
         </w:rPr>
-        <w:t>填之前去**接口文档**确认当前名字，那是唯一准的。</w:t>
+        <w:t>填之前去</w:t>
+      </w:r>
+      <w:r>
+        <w:rPr>
+          <w:rFonts w:ascii="Times New Roman" w:hAnsi="Times New Roman" w:eastAsia="宋体"/>
+          <w:b/>
+          <w:sz w:val="21"/>
+        </w:rPr>
+        <w:t>接口文档</w:t>
+      </w:r>
+      <w:r>
+        <w:rPr>
+          <w:rFonts w:ascii="Times New Roman" w:hAnsi="Times New Roman" w:eastAsia="宋体"/>
+          <w:b w:val="0"/>
+          <w:sz w:val="21"/>
+        </w:rPr>
+        <w:t>确认当前名字，那是唯一准的。</w:t>
       </w:r>
     </w:p>
     <w:p>
@@ -1242,17 +1682,57 @@
           <w:b w:val="0"/>
           <w:sz w:val="21"/>
         </w:rPr>
-        <w:t>截图上还有一条：旧模型名仍可调用，但已指向新模型——**不确定就用文档里写的那个**。</w:t>
+        <w:t>截图上还有一条：旧模型名仍可调用，但已指向新模型——</w:t>
+      </w:r>
+      <w:r>
+        <w:rPr>
+          <w:rFonts w:ascii="Times New Roman" w:hAnsi="Times New Roman" w:eastAsia="宋体"/>
+          <w:b/>
+          <w:sz w:val="21"/>
+        </w:rPr>
+        <w:t>不确定就用文档里写的那个</w:t>
+      </w:r>
+      <w:r>
+        <w:rPr>
+          <w:rFonts w:ascii="Times New Roman" w:hAnsi="Times New Roman" w:eastAsia="宋体"/>
+          <w:b w:val="0"/>
+          <w:sz w:val="21"/>
+        </w:rPr>
+        <w:t>。</w:t>
       </w:r>
     </w:p>
     <w:p>
       <w:r>
         <w:rPr>
           <w:rFonts w:ascii="Times New Roman" w:hAnsi="Times New Roman" w:eastAsia="宋体"/>
+          <w:b/>
+          <w:sz w:val="21"/>
+        </w:rPr>
+        <w:t>第 6 步｜充值。</w:t>
+      </w:r>
+      <w:r>
+        <w:rPr>
+          <w:rFonts w:ascii="Times New Roman" w:hAnsi="Times New Roman" w:eastAsia="宋体"/>
           <w:b w:val="0"/>
           <w:sz w:val="21"/>
         </w:rPr>
-        <w:t>**第 6 步｜充值。** 进左侧「充值」，充一点余额。**不充余额调用会失败**（报 401 或余额不足）。</w:t>
+        <w:t xml:space="preserve"> 进左侧「充值」，充一点余额。</w:t>
+      </w:r>
+      <w:r>
+        <w:rPr>
+          <w:rFonts w:ascii="Times New Roman" w:hAnsi="Times New Roman" w:eastAsia="宋体"/>
+          <w:b/>
+          <w:sz w:val="21"/>
+        </w:rPr>
+        <w:t>不充余额调用会失败</w:t>
+      </w:r>
+      <w:r>
+        <w:rPr>
+          <w:rFonts w:ascii="Times New Roman" w:hAnsi="Times New Roman" w:eastAsia="宋体"/>
+          <w:b w:val="0"/>
+          <w:sz w:val="21"/>
+        </w:rPr>
+        <w:t>（报 401 或余额不足）。</w:t>
       </w:r>
     </w:p>
     <w:p>
@@ -1285,7 +1765,23 @@
           <w:b w:val="0"/>
           <w:sz w:val="21"/>
         </w:rPr>
-        <w:t>套路都一样：**开通服务 → 创建 API Key → 复制「兼容 OpenAI」的地址**。</w:t>
+        <w:t>套路都一样：</w:t>
+      </w:r>
+      <w:r>
+        <w:rPr>
+          <w:rFonts w:ascii="Times New Roman" w:hAnsi="Times New Roman" w:eastAsia="宋体"/>
+          <w:b/>
+          <w:sz w:val="21"/>
+        </w:rPr>
+        <w:t>开通服务 → 创建 API Key → 复制「兼容 OpenAI」的地址</w:t>
+      </w:r>
+      <w:r>
+        <w:rPr>
+          <w:rFonts w:ascii="Times New Roman" w:hAnsi="Times New Roman" w:eastAsia="宋体"/>
+          <w:b w:val="0"/>
+          <w:sz w:val="21"/>
+        </w:rPr>
+        <w:t>。</w:t>
       </w:r>
     </w:p>
     <w:tbl>
@@ -1357,11 +1853,11 @@
             <w:r/>
             <w:r>
               <w:rPr>
-                <w:rFonts w:ascii="Times New Roman" w:hAnsi="Times New Roman" w:eastAsia="宋体"/>
+                <w:rFonts w:ascii="Courier New" w:hAnsi="Courier New" w:eastAsia="宋体"/>
                 <w:b w:val="0"/>
                 <w:sz w:val="19"/>
               </w:rPr>
-              <w:t>`https://dashscope.aliyuncs.com/compatible-mode/v1`</w:t>
+              <w:t>https://dashscope.aliyuncs.com/compatible-mode/v1</w:t>
             </w:r>
           </w:p>
         </w:tc>
@@ -1391,11 +1887,11 @@
             <w:r/>
             <w:r>
               <w:rPr>
-                <w:rFonts w:ascii="Times New Roman" w:hAnsi="Times New Roman" w:eastAsia="宋体"/>
+                <w:rFonts w:ascii="Courier New" w:hAnsi="Courier New" w:eastAsia="宋体"/>
                 <w:b w:val="0"/>
                 <w:sz w:val="19"/>
               </w:rPr>
-              <w:t>`https://open.bigmodel.cn/api/paas/v4`</w:t>
+              <w:t>https://open.bigmodel.cn/api/paas/v4</w:t>
             </w:r>
           </w:p>
         </w:tc>
@@ -1425,11 +1921,11 @@
             <w:r/>
             <w:r>
               <w:rPr>
-                <w:rFonts w:ascii="Times New Roman" w:hAnsi="Times New Roman" w:eastAsia="宋体"/>
+                <w:rFonts w:ascii="Courier New" w:hAnsi="Courier New" w:eastAsia="宋体"/>
                 <w:b w:val="0"/>
                 <w:sz w:val="19"/>
               </w:rPr>
-              <w:t>`https://api.moonshot.cn/v1`</w:t>
+              <w:t>https://api.moonshot.cn/v1</w:t>
             </w:r>
           </w:p>
         </w:tc>
@@ -1536,10 +2032,10 @@
             <w:r>
               <w:rPr>
                 <w:rFonts w:ascii="Times New Roman" w:hAnsi="Times New Roman" w:eastAsia="宋体"/>
-                <w:b w:val="0"/>
+                <w:b/>
                 <w:sz w:val="19"/>
               </w:rPr>
-              <w:t>**401 / 403**</w:t>
+              <w:t>401 / 403</w:t>
             </w:r>
           </w:p>
         </w:tc>
@@ -1570,10 +2066,10 @@
             <w:r>
               <w:rPr>
                 <w:rFonts w:ascii="Times New Roman" w:hAnsi="Times New Roman" w:eastAsia="宋体"/>
-                <w:b w:val="0"/>
+                <w:b/>
                 <w:sz w:val="19"/>
               </w:rPr>
-              <w:t>**404**</w:t>
+              <w:t>404</w:t>
             </w:r>
           </w:p>
         </w:tc>
@@ -1589,7 +2085,23 @@
                 <w:b w:val="0"/>
                 <w:sz w:val="19"/>
               </w:rPr>
-              <w:t>地址少了/多了 `/v1`（软件会自动兜底试一次，仍失败就是地址不对）</w:t>
+              <w:t xml:space="preserve">地址少了/多了 </w:t>
+            </w:r>
+            <w:r>
+              <w:rPr>
+                <w:rFonts w:ascii="Courier New" w:hAnsi="Courier New" w:eastAsia="宋体"/>
+                <w:b w:val="0"/>
+                <w:sz w:val="19"/>
+              </w:rPr>
+              <w:t>/v1</w:t>
+            </w:r>
+            <w:r>
+              <w:rPr>
+                <w:rFonts w:ascii="Times New Roman" w:hAnsi="Times New Roman" w:eastAsia="宋体"/>
+                <w:b w:val="0"/>
+                <w:sz w:val="19"/>
+              </w:rPr>
+              <w:t>（软件会自动兜底试一次，仍失败就是地址不对）</w:t>
             </w:r>
           </w:p>
         </w:tc>
@@ -1604,10 +2116,10 @@
             <w:r>
               <w:rPr>
                 <w:rFonts w:ascii="Times New Roman" w:hAnsi="Times New Roman" w:eastAsia="宋体"/>
-                <w:b w:val="0"/>
+                <w:b/>
                 <w:sz w:val="19"/>
               </w:rPr>
-              <w:t>**超时**</w:t>
+              <w:t>超时</w:t>
             </w:r>
           </w:p>
         </w:tc>
@@ -1638,10 +2150,10 @@
             <w:r>
               <w:rPr>
                 <w:rFonts w:ascii="Times New Roman" w:hAnsi="Times New Roman" w:eastAsia="宋体"/>
-                <w:b w:val="0"/>
+                <w:b/>
                 <w:sz w:val="19"/>
               </w:rPr>
-              <w:t>**不支持看图**</w:t>
+              <w:t>不支持看图</w:t>
             </w:r>
           </w:p>
         </w:tc>
@@ -1671,7 +2183,7 @@
       <w:r>
         <w:drawing>
           <wp:inline xmlns:a="http://schemas.openxmlformats.org/drawingml/2006/main" xmlns:pic="http://schemas.openxmlformats.org/drawingml/2006/picture">
-            <wp:extent cx="5580000" cy="2817624"/>
+            <wp:extent cx="5580000" cy="2750745"/>
             <wp:docPr id="6" name="Picture 6"/>
             <wp:cNvGraphicFramePr>
               <a:graphicFrameLocks noChangeAspect="1"/>
@@ -1692,7 +2204,7 @@
                   <pic:spPr>
                     <a:xfrm>
                       <a:off x="0" y="0"/>
-                      <a:ext cx="5580000" cy="2817624"/>
+                      <a:ext cx="5580000" cy="2750745"/>
                     </a:xfrm>
                     <a:prstGeom prst="rect"/>
                   </pic:spPr>
@@ -1804,10 +2316,18 @@
       <w:r>
         <w:rPr>
           <w:rFonts w:ascii="Times New Roman" w:hAnsi="Times New Roman" w:eastAsia="宋体"/>
+          <w:b/>
+          <w:sz w:val="21"/>
+        </w:rPr>
+        <w:t>贴题目</w:t>
+      </w:r>
+      <w:r>
+        <w:rPr>
+          <w:rFonts w:ascii="Times New Roman" w:hAnsi="Times New Roman" w:eastAsia="宋体"/>
           <w:b w:val="0"/>
           <w:sz w:val="21"/>
         </w:rPr>
-        <w:t>**贴题目**：在「解题」页把题面粘进左侧文本框，或者点「选择图片」传照片；</w:t>
+        <w:t>：在「解题」页把题面粘进左侧文本框，或者点「选择图片」传照片；</w:t>
       </w:r>
     </w:p>
     <w:p>
@@ -1818,10 +2338,18 @@
       <w:r>
         <w:rPr>
           <w:rFonts w:ascii="Times New Roman" w:hAnsi="Times New Roman" w:eastAsia="宋体"/>
+          <w:b/>
+          <w:sz w:val="21"/>
+        </w:rPr>
+        <w:t>可选补充</w:t>
+      </w:r>
+      <w:r>
+        <w:rPr>
+          <w:rFonts w:ascii="Times New Roman" w:hAnsi="Times New Roman" w:eastAsia="宋体"/>
           <w:b w:val="0"/>
           <w:sz w:val="21"/>
         </w:rPr>
-        <w:t>**可选补充**：如果有参考答案或解析，填进「参考答案 / 解析」——填了模型就按你的解析整理，</w:t>
+        <w:t>：如果有参考答案或解析，填进「参考答案 / 解析」——填了模型就按你的解析整理，</w:t>
       </w:r>
     </w:p>
     <w:p>
@@ -1842,10 +2370,18 @@
       <w:r>
         <w:rPr>
           <w:rFonts w:ascii="Times New Roman" w:hAnsi="Times New Roman" w:eastAsia="宋体"/>
+          <w:b/>
+          <w:sz w:val="21"/>
+        </w:rPr>
+        <w:t>点「开始生成动画」</w:t>
+      </w:r>
+      <w:r>
+        <w:rPr>
+          <w:rFonts w:ascii="Times New Roman" w:hAnsi="Times New Roman" w:eastAsia="宋体"/>
           <w:b w:val="0"/>
           <w:sz w:val="21"/>
         </w:rPr>
-        <w:t>**点「开始生成动画」**；</w:t>
+        <w:t>；</w:t>
       </w:r>
     </w:p>
     <w:p>
@@ -1873,7 +2409,23 @@
           <w:b w:val="0"/>
           <w:sz w:val="21"/>
         </w:rPr>
-        <w:t>看**校验报告**；</w:t>
+        <w:t>看</w:t>
+      </w:r>
+      <w:r>
+        <w:rPr>
+          <w:rFonts w:ascii="Times New Roman" w:hAnsi="Times New Roman" w:eastAsia="宋体"/>
+          <w:b/>
+          <w:sz w:val="21"/>
+        </w:rPr>
+        <w:t>校验报告</w:t>
+      </w:r>
+      <w:r>
+        <w:rPr>
+          <w:rFonts w:ascii="Times New Roman" w:hAnsi="Times New Roman" w:eastAsia="宋体"/>
+          <w:b w:val="0"/>
+          <w:sz w:val="21"/>
+        </w:rPr>
+        <w:t>；</w:t>
       </w:r>
     </w:p>
     <w:p>
@@ -2022,10 +2574,10 @@
             <w:r>
               <w:rPr>
                 <w:rFonts w:ascii="Times New Roman" w:hAnsi="Times New Roman" w:eastAsia="宋体"/>
-                <w:b w:val="0"/>
+                <w:b/>
                 <w:sz w:val="19"/>
               </w:rPr>
-              <w:t>**阶段大标题**</w:t>
+              <w:t>阶段大标题</w:t>
             </w:r>
           </w:p>
         </w:tc>
@@ -2056,10 +2608,10 @@
             <w:r>
               <w:rPr>
                 <w:rFonts w:ascii="Times New Roman" w:hAnsi="Times New Roman" w:eastAsia="宋体"/>
-                <w:b w:val="0"/>
+                <w:b/>
                 <w:sz w:val="19"/>
               </w:rPr>
-              <w:t>**校验报告**</w:t>
+              <w:t>校验报告</w:t>
             </w:r>
           </w:p>
         </w:tc>
@@ -2090,10 +2642,10 @@
             <w:r>
               <w:rPr>
                 <w:rFonts w:ascii="Times New Roman" w:hAnsi="Times New Roman" w:eastAsia="宋体"/>
-                <w:b w:val="0"/>
+                <w:b/>
                 <w:sz w:val="19"/>
               </w:rPr>
-              <w:t>**知识卡依据**</w:t>
+              <w:t>知识卡依据</w:t>
             </w:r>
           </w:p>
         </w:tc>
@@ -2119,10 +2671,18 @@
       <w:r>
         <w:rPr>
           <w:rFonts w:ascii="Times New Roman" w:hAnsi="Times New Roman" w:eastAsia="宋体"/>
+          <w:b/>
+          <w:sz w:val="21"/>
+        </w:rPr>
+        <w:t>动画不理想时，先看这两处</w:t>
+      </w:r>
+      <w:r>
+        <w:rPr>
+          <w:rFonts w:ascii="Times New Roman" w:hAnsi="Times New Roman" w:eastAsia="宋体"/>
           <w:b w:val="0"/>
           <w:sz w:val="21"/>
         </w:rPr>
-        <w:t>**动画不理想时，先看这两处**：报告说哪条没过，通常是画法问题；卡片依据命中的不对，</w:t>
+        <w:t>：报告说哪条没过，通常是画法问题；卡片依据命中的不对，</w:t>
       </w:r>
     </w:p>
     <w:p>
@@ -2435,7 +2995,23 @@
           <w:b w:val="0"/>
           <w:sz w:val="21"/>
         </w:rPr>
-        <w:t>时间轴显示的是「第 k / n 步」，不显示秒；但**曲线图的横轴是真实物理秒**。</w:t>
+        <w:t>时间轴显示的是「第 k / n 步」，不显示秒；但</w:t>
+      </w:r>
+      <w:r>
+        <w:rPr>
+          <w:rFonts w:ascii="Times New Roman" w:hAnsi="Times New Roman" w:eastAsia="宋体"/>
+          <w:b/>
+          <w:sz w:val="21"/>
+        </w:rPr>
+        <w:t>曲线图的横轴是真实物理秒</w:t>
+      </w:r>
+      <w:r>
+        <w:rPr>
+          <w:rFonts w:ascii="Times New Roman" w:hAnsi="Times New Roman" w:eastAsia="宋体"/>
+          <w:b w:val="0"/>
+          <w:sz w:val="21"/>
+        </w:rPr>
+        <w:t>。</w:t>
       </w:r>
     </w:p>
     <w:p>
@@ -2592,7 +3168,23 @@
           <w:b w:val="0"/>
           <w:sz w:val="21"/>
         </w:rPr>
-        <w:t>进「设置」→ **提示词卡**；</w:t>
+        <w:t xml:space="preserve">进「设置」→ </w:t>
+      </w:r>
+      <w:r>
+        <w:rPr>
+          <w:rFonts w:ascii="Times New Roman" w:hAnsi="Times New Roman" w:eastAsia="宋体"/>
+          <w:b/>
+          <w:sz w:val="21"/>
+        </w:rPr>
+        <w:t>提示词卡</w:t>
+      </w:r>
+      <w:r>
+        <w:rPr>
+          <w:rFonts w:ascii="Times New Roman" w:hAnsi="Times New Roman" w:eastAsia="宋体"/>
+          <w:b w:val="0"/>
+          <w:sz w:val="21"/>
+        </w:rPr>
+        <w:t>；</w:t>
       </w:r>
     </w:p>
     <w:p>
@@ -2620,7 +3212,23 @@
           <w:b w:val="0"/>
           <w:sz w:val="21"/>
         </w:rPr>
-        <w:t>点 **保存到本机**（写之前会自动备份）；</w:t>
+        <w:t xml:space="preserve">点 </w:t>
+      </w:r>
+      <w:r>
+        <w:rPr>
+          <w:rFonts w:ascii="Times New Roman" w:hAnsi="Times New Roman" w:eastAsia="宋体"/>
+          <w:b/>
+          <w:sz w:val="21"/>
+        </w:rPr>
+        <w:t>保存到本机</w:t>
+      </w:r>
+      <w:r>
+        <w:rPr>
+          <w:rFonts w:ascii="Times New Roman" w:hAnsi="Times New Roman" w:eastAsia="宋体"/>
+          <w:b w:val="0"/>
+          <w:sz w:val="21"/>
+        </w:rPr>
+        <w:t>（写之前会自动备份）；</w:t>
       </w:r>
     </w:p>
     <w:p>
@@ -2634,7 +3242,23 @@
           <w:b w:val="0"/>
           <w:sz w:val="21"/>
         </w:rPr>
-        <w:t>改完对**下一道题**生效，正在跑的题不受影响。</w:t>
+        <w:t>改完对</w:t>
+      </w:r>
+      <w:r>
+        <w:rPr>
+          <w:rFonts w:ascii="Times New Roman" w:hAnsi="Times New Roman" w:eastAsia="宋体"/>
+          <w:b/>
+          <w:sz w:val="21"/>
+        </w:rPr>
+        <w:t>下一道题</w:t>
+      </w:r>
+      <w:r>
+        <w:rPr>
+          <w:rFonts w:ascii="Times New Roman" w:hAnsi="Times New Roman" w:eastAsia="宋体"/>
+          <w:b w:val="0"/>
+          <w:sz w:val="21"/>
+        </w:rPr>
+        <w:t>生效，正在跑的题不受影响。</w:t>
       </w:r>
     </w:p>
     <w:p>
@@ -2644,7 +3268,23 @@
           <w:b w:val="0"/>
           <w:sz w:val="21"/>
         </w:rPr>
-        <w:t>想退回官方版本：点 **恢复本版内置**（只撤销你改过的，不影响你自己新建的内容）。</w:t>
+        <w:t xml:space="preserve">想退回官方版本：点 </w:t>
+      </w:r>
+      <w:r>
+        <w:rPr>
+          <w:rFonts w:ascii="Times New Roman" w:hAnsi="Times New Roman" w:eastAsia="宋体"/>
+          <w:b/>
+          <w:sz w:val="21"/>
+        </w:rPr>
+        <w:t>恢复本版内置</w:t>
+      </w:r>
+      <w:r>
+        <w:rPr>
+          <w:rFonts w:ascii="Times New Roman" w:hAnsi="Times New Roman" w:eastAsia="宋体"/>
+          <w:b w:val="0"/>
+          <w:sz w:val="21"/>
+        </w:rPr>
+        <w:t>（只撤销你改过的，不影响你自己新建的内容）。</w:t>
       </w:r>
     </w:p>
     <w:p>
@@ -2654,7 +3294,23 @@
           <w:b w:val="0"/>
           <w:sz w:val="21"/>
         </w:rPr>
-        <w:t>⚠ 提示词里有几个**必须保留的记号**，删了会保存失败并告诉你缺哪个——</w:t>
+        <w:t>⚠ 提示词里有几个</w:t>
+      </w:r>
+      <w:r>
+        <w:rPr>
+          <w:rFonts w:ascii="Times New Roman" w:hAnsi="Times New Roman" w:eastAsia="宋体"/>
+          <w:b/>
+          <w:sz w:val="21"/>
+        </w:rPr>
+        <w:t>必须保留的记号</w:t>
+      </w:r>
+      <w:r>
+        <w:rPr>
+          <w:rFonts w:ascii="Times New Roman" w:hAnsi="Times New Roman" w:eastAsia="宋体"/>
+          <w:b w:val="0"/>
+          <w:sz w:val="21"/>
+        </w:rPr>
+        <w:t>，删了会保存失败并告诉你缺哪个——</w:t>
       </w:r>
     </w:p>
     <w:p>
@@ -2766,7 +3422,23 @@
           <w:b w:val="0"/>
           <w:sz w:val="21"/>
         </w:rPr>
-        <w:t>进「设置」→ **知识卡** → 新建；</w:t>
+        <w:t xml:space="preserve">进「设置」→ </w:t>
+      </w:r>
+      <w:r>
+        <w:rPr>
+          <w:rFonts w:ascii="Times New Roman" w:hAnsi="Times New Roman" w:eastAsia="宋体"/>
+          <w:b/>
+          <w:sz w:val="21"/>
+        </w:rPr>
+        <w:t>知识卡</w:t>
+      </w:r>
+      <w:r>
+        <w:rPr>
+          <w:rFonts w:ascii="Times New Roman" w:hAnsi="Times New Roman" w:eastAsia="宋体"/>
+          <w:b w:val="0"/>
+          <w:sz w:val="21"/>
+        </w:rPr>
+        <w:t xml:space="preserve"> → 新建；</w:t>
       </w:r>
     </w:p>
     <w:p>
@@ -2780,7 +3452,39 @@
           <w:b w:val="0"/>
           <w:sz w:val="21"/>
         </w:rPr>
-        <w:t>选类型：**元件卡**（一个元件）或**场景卡**（一个场景）；</w:t>
+        <w:t>选类型：</w:t>
+      </w:r>
+      <w:r>
+        <w:rPr>
+          <w:rFonts w:ascii="Times New Roman" w:hAnsi="Times New Roman" w:eastAsia="宋体"/>
+          <w:b/>
+          <w:sz w:val="21"/>
+        </w:rPr>
+        <w:t>元件卡</w:t>
+      </w:r>
+      <w:r>
+        <w:rPr>
+          <w:rFonts w:ascii="Times New Roman" w:hAnsi="Times New Roman" w:eastAsia="宋体"/>
+          <w:b w:val="0"/>
+          <w:sz w:val="21"/>
+        </w:rPr>
+        <w:t>（一个元件）或</w:t>
+      </w:r>
+      <w:r>
+        <w:rPr>
+          <w:rFonts w:ascii="Times New Roman" w:hAnsi="Times New Roman" w:eastAsia="宋体"/>
+          <w:b/>
+          <w:sz w:val="21"/>
+        </w:rPr>
+        <w:t>场景卡</w:t>
+      </w:r>
+      <w:r>
+        <w:rPr>
+          <w:rFonts w:ascii="Times New Roman" w:hAnsi="Times New Roman" w:eastAsia="宋体"/>
+          <w:b w:val="0"/>
+          <w:sz w:val="21"/>
+        </w:rPr>
+        <w:t>（一个场景）；</w:t>
       </w:r>
     </w:p>
     <w:p>
@@ -2805,10 +3509,18 @@
       <w:r>
         <w:rPr>
           <w:rFonts w:ascii="Times New Roman" w:hAnsi="Times New Roman" w:eastAsia="宋体"/>
+          <w:b/>
+          <w:sz w:val="21"/>
+        </w:rPr>
+        <w:t>触发</w:t>
+      </w:r>
+      <w:r>
+        <w:rPr>
+          <w:rFonts w:ascii="Times New Roman" w:hAnsi="Times New Roman" w:eastAsia="宋体"/>
           <w:b w:val="0"/>
           <w:sz w:val="21"/>
         </w:rPr>
-        <w:t>**触发**：来自词表，选元件或场景，不是自己写关键词；</w:t>
+        <w:t>：来自词表，选元件或场景，不是自己写关键词；</w:t>
       </w:r>
     </w:p>
     <w:p>
@@ -2819,10 +3531,18 @@
       <w:r>
         <w:rPr>
           <w:rFonts w:ascii="Times New Roman" w:hAnsi="Times New Roman" w:eastAsia="宋体"/>
+          <w:b/>
+          <w:sz w:val="21"/>
+        </w:rPr>
+        <w:t>画法</w:t>
+      </w:r>
+      <w:r>
+        <w:rPr>
+          <w:rFonts w:ascii="Times New Roman" w:hAnsi="Times New Roman" w:eastAsia="宋体"/>
           <w:b w:val="0"/>
           <w:sz w:val="21"/>
         </w:rPr>
-        <w:t>**画法**：怎么画、有哪些易错点；</w:t>
+        <w:t>：怎么画、有哪些易错点；</w:t>
       </w:r>
     </w:p>
     <w:p>
@@ -2833,10 +3553,34 @@
       <w:r>
         <w:rPr>
           <w:rFonts w:ascii="Times New Roman" w:hAnsi="Times New Roman" w:eastAsia="宋体"/>
+          <w:b/>
+          <w:sz w:val="21"/>
+        </w:rPr>
+        <w:t>生成后自检</w:t>
+      </w:r>
+      <w:r>
+        <w:rPr>
+          <w:rFonts w:ascii="Times New Roman" w:hAnsi="Times New Roman" w:eastAsia="宋体"/>
           <w:b w:val="0"/>
           <w:sz w:val="21"/>
         </w:rPr>
-        <w:t>**生成后自检**：几条能自查的判据 + 一段**能跑通的示例代码**；</w:t>
+        <w:t>：几条能自查的判据 + 一段</w:t>
+      </w:r>
+      <w:r>
+        <w:rPr>
+          <w:rFonts w:ascii="Times New Roman" w:hAnsi="Times New Roman" w:eastAsia="宋体"/>
+          <w:b/>
+          <w:sz w:val="21"/>
+        </w:rPr>
+        <w:t>能跑通的示例代码</w:t>
+      </w:r>
+      <w:r>
+        <w:rPr>
+          <w:rFonts w:ascii="Times New Roman" w:hAnsi="Times New Roman" w:eastAsia="宋体"/>
+          <w:b w:val="0"/>
+          <w:sz w:val="21"/>
+        </w:rPr>
+        <w:t>；</w:t>
       </w:r>
     </w:p>
     <w:p>
@@ -2871,10 +3615,18 @@
       <w:r>
         <w:rPr>
           <w:rFonts w:ascii="Times New Roman" w:hAnsi="Times New Roman" w:eastAsia="宋体"/>
+          <w:b/>
+          <w:sz w:val="21"/>
+        </w:rPr>
+        <w:t>一张卡只讲一个元件或一个场景</w:t>
+      </w:r>
+      <w:r>
+        <w:rPr>
+          <w:rFonts w:ascii="Times New Roman" w:hAnsi="Times New Roman" w:eastAsia="宋体"/>
           <w:b w:val="0"/>
           <w:sz w:val="21"/>
         </w:rPr>
-        <w:t>**一张卡只讲一个元件或一个场景**，别贪多；</w:t>
+        <w:t>，别贪多；</w:t>
       </w:r>
     </w:p>
     <w:p>
@@ -2902,7 +3654,39 @@
           <w:b w:val="0"/>
           <w:sz w:val="21"/>
         </w:rPr>
-        <w:t>示例代码要能通过静态检查（不能出现 `require`、`eval` 这类调用）。</w:t>
+        <w:t xml:space="preserve">示例代码要能通过静态检查（不能出现 </w:t>
+      </w:r>
+      <w:r>
+        <w:rPr>
+          <w:rFonts w:ascii="Courier New" w:hAnsi="Courier New" w:eastAsia="宋体"/>
+          <w:b w:val="0"/>
+          <w:sz w:val="21"/>
+        </w:rPr>
+        <w:t>require</w:t>
+      </w:r>
+      <w:r>
+        <w:rPr>
+          <w:rFonts w:ascii="Times New Roman" w:hAnsi="Times New Roman" w:eastAsia="宋体"/>
+          <w:b w:val="0"/>
+          <w:sz w:val="21"/>
+        </w:rPr>
+        <w:t>、</w:t>
+      </w:r>
+      <w:r>
+        <w:rPr>
+          <w:rFonts w:ascii="Courier New" w:hAnsi="Courier New" w:eastAsia="宋体"/>
+          <w:b w:val="0"/>
+          <w:sz w:val="21"/>
+        </w:rPr>
+        <w:t>eval</w:t>
+      </w:r>
+      <w:r>
+        <w:rPr>
+          <w:rFonts w:ascii="Times New Roman" w:hAnsi="Times New Roman" w:eastAsia="宋体"/>
+          <w:b w:val="0"/>
+          <w:sz w:val="21"/>
+        </w:rPr>
+        <w:t xml:space="preserve"> 这类调用）。</w:t>
       </w:r>
     </w:p>
     <w:p>
@@ -2912,7 +3696,23 @@
           <w:b w:val="0"/>
           <w:sz w:val="21"/>
         </w:rPr>
-        <w:t>改坏了能回退：**恢复本版内置**只撤销对内置卡的覆盖，不删你自建的卡。</w:t>
+        <w:t>改坏了能回退：</w:t>
+      </w:r>
+      <w:r>
+        <w:rPr>
+          <w:rFonts w:ascii="Times New Roman" w:hAnsi="Times New Roman" w:eastAsia="宋体"/>
+          <w:b/>
+          <w:sz w:val="21"/>
+        </w:rPr>
+        <w:t>恢复本版内置</w:t>
+      </w:r>
+      <w:r>
+        <w:rPr>
+          <w:rFonts w:ascii="Times New Roman" w:hAnsi="Times New Roman" w:eastAsia="宋体"/>
+          <w:b w:val="0"/>
+          <w:sz w:val="21"/>
+        </w:rPr>
+        <w:t>只撤销对内置卡的覆盖，不删你自建的卡。</w:t>
       </w:r>
     </w:p>
     <w:p>
@@ -3000,7 +3800,23 @@
           <w:b w:val="0"/>
           <w:sz w:val="21"/>
         </w:rPr>
-        <w:t>点导航栏的 **导出 ▾**：</w:t>
+        <w:t xml:space="preserve">点导航栏的 </w:t>
+      </w:r>
+      <w:r>
+        <w:rPr>
+          <w:rFonts w:ascii="Times New Roman" w:hAnsi="Times New Roman" w:eastAsia="宋体"/>
+          <w:b/>
+          <w:sz w:val="21"/>
+        </w:rPr>
+        <w:t>导出 ▾</w:t>
+      </w:r>
+      <w:r>
+        <w:rPr>
+          <w:rFonts w:ascii="Times New Roman" w:hAnsi="Times New Roman" w:eastAsia="宋体"/>
+          <w:b w:val="0"/>
+          <w:sz w:val="21"/>
+        </w:rPr>
+        <w:t>：</w:t>
       </w:r>
     </w:p>
     <w:tbl>
@@ -3123,7 +3939,23 @@
           <w:b w:val="0"/>
           <w:sz w:val="21"/>
         </w:rPr>
-        <w:t>产物固定落在 `文档\小肥鱼物理解题动画\导出\`，界面里有「打开导出文件夹」按钮。</w:t>
+        <w:t xml:space="preserve">产物固定落在 </w:t>
+      </w:r>
+      <w:r>
+        <w:rPr>
+          <w:rFonts w:ascii="Courier New" w:hAnsi="Courier New" w:eastAsia="宋体"/>
+          <w:b w:val="0"/>
+          <w:sz w:val="21"/>
+        </w:rPr>
+        <w:t>文档\小肥鱼物理解题动画\导出\</w:t>
+      </w:r>
+      <w:r>
+        <w:rPr>
+          <w:rFonts w:ascii="Times New Roman" w:hAnsi="Times New Roman" w:eastAsia="宋体"/>
+          <w:b w:val="0"/>
+          <w:sz w:val="21"/>
+        </w:rPr>
+        <w:t>，界面里有「打开导出文件夹」按钮。</w:t>
       </w:r>
     </w:p>
     <w:p>
@@ -3263,10 +4095,34 @@
       <w:r>
         <w:rPr>
           <w:rFonts w:ascii="Times New Roman" w:hAnsi="Times New Roman" w:eastAsia="宋体"/>
+          <w:b/>
+          <w:sz w:val="21"/>
+        </w:rPr>
+        <w:t>先别急着重装。</w:t>
+      </w:r>
+      <w:r>
+        <w:rPr>
+          <w:rFonts w:ascii="Times New Roman" w:hAnsi="Times New Roman" w:eastAsia="宋体"/>
           <w:b w:val="0"/>
           <w:sz w:val="21"/>
         </w:rPr>
-        <w:t>**先别急着重装。** 每跑完一道题，软件都会在 软件所在文件夹\`开源日志` 里留一份现场</w:t>
+        <w:t xml:space="preserve"> 每跑完一道题，软件都会在 软件所在文件夹\</w:t>
+      </w:r>
+      <w:r>
+        <w:rPr>
+          <w:rFonts w:ascii="Courier New" w:hAnsi="Courier New" w:eastAsia="宋体"/>
+          <w:b w:val="0"/>
+          <w:sz w:val="21"/>
+        </w:rPr>
+        <w:t>开源日志</w:t>
+      </w:r>
+      <w:r>
+        <w:rPr>
+          <w:rFonts w:ascii="Times New Roman" w:hAnsi="Times New Roman" w:eastAsia="宋体"/>
+          <w:b w:val="0"/>
+          <w:sz w:val="21"/>
+        </w:rPr>
+        <w:t xml:space="preserve"> 里留一份现场</w:t>
       </w:r>
     </w:p>
     <w:p>
@@ -3283,10 +4139,10 @@
       <w:r>
         <w:rPr>
           <w:rFonts w:ascii="Times New Roman" w:hAnsi="Times New Roman" w:eastAsia="宋体"/>
-          <w:b w:val="0"/>
+          <w:b/>
           <w:sz w:val="21"/>
         </w:rPr>
-        <w:t>**发给我的步骤：**</w:t>
+        <w:t>发给我的步骤：</w:t>
       </w:r>
     </w:p>
     <w:p>
@@ -3300,7 +4156,71 @@
           <w:b w:val="0"/>
           <w:sz w:val="21"/>
         </w:rPr>
-        <w:t>打开 `开源日志` 文件夹，找到**时间最新的那一对文件**（`.html` + `.json`）；</w:t>
+        <w:t xml:space="preserve">打开 </w:t>
+      </w:r>
+      <w:r>
+        <w:rPr>
+          <w:rFonts w:ascii="Courier New" w:hAnsi="Courier New" w:eastAsia="宋体"/>
+          <w:b w:val="0"/>
+          <w:sz w:val="21"/>
+        </w:rPr>
+        <w:t>开源日志</w:t>
+      </w:r>
+      <w:r>
+        <w:rPr>
+          <w:rFonts w:ascii="Times New Roman" w:hAnsi="Times New Roman" w:eastAsia="宋体"/>
+          <w:b w:val="0"/>
+          <w:sz w:val="21"/>
+        </w:rPr>
+        <w:t xml:space="preserve"> 文件夹，找到</w:t>
+      </w:r>
+      <w:r>
+        <w:rPr>
+          <w:rFonts w:ascii="Times New Roman" w:hAnsi="Times New Roman" w:eastAsia="宋体"/>
+          <w:b/>
+          <w:sz w:val="21"/>
+        </w:rPr>
+        <w:t>时间最新的那一对文件</w:t>
+      </w:r>
+      <w:r>
+        <w:rPr>
+          <w:rFonts w:ascii="Times New Roman" w:hAnsi="Times New Roman" w:eastAsia="宋体"/>
+          <w:b w:val="0"/>
+          <w:sz w:val="21"/>
+        </w:rPr>
+        <w:t>（</w:t>
+      </w:r>
+      <w:r>
+        <w:rPr>
+          <w:rFonts w:ascii="Courier New" w:hAnsi="Courier New" w:eastAsia="宋体"/>
+          <w:b w:val="0"/>
+          <w:sz w:val="21"/>
+        </w:rPr>
+        <w:t>.html</w:t>
+      </w:r>
+      <w:r>
+        <w:rPr>
+          <w:rFonts w:ascii="Times New Roman" w:hAnsi="Times New Roman" w:eastAsia="宋体"/>
+          <w:b w:val="0"/>
+          <w:sz w:val="21"/>
+        </w:rPr>
+        <w:t xml:space="preserve"> + </w:t>
+      </w:r>
+      <w:r>
+        <w:rPr>
+          <w:rFonts w:ascii="Courier New" w:hAnsi="Courier New" w:eastAsia="宋体"/>
+          <w:b w:val="0"/>
+          <w:sz w:val="21"/>
+        </w:rPr>
+        <w:t>.json</w:t>
+      </w:r>
+      <w:r>
+        <w:rPr>
+          <w:rFonts w:ascii="Times New Roman" w:hAnsi="Times New Roman" w:eastAsia="宋体"/>
+          <w:b w:val="0"/>
+          <w:sz w:val="21"/>
+        </w:rPr>
+        <w:t>）；</w:t>
       </w:r>
     </w:p>
     <w:p>
@@ -3314,7 +4234,23 @@
           <w:b w:val="0"/>
           <w:sz w:val="21"/>
         </w:rPr>
-        <w:t>把**整个文件夹**打包成 zip；</w:t>
+        <w:t>把</w:t>
+      </w:r>
+      <w:r>
+        <w:rPr>
+          <w:rFonts w:ascii="Times New Roman" w:hAnsi="Times New Roman" w:eastAsia="宋体"/>
+          <w:b/>
+          <w:sz w:val="21"/>
+        </w:rPr>
+        <w:t>整个文件夹</w:t>
+      </w:r>
+      <w:r>
+        <w:rPr>
+          <w:rFonts w:ascii="Times New Roman" w:hAnsi="Times New Roman" w:eastAsia="宋体"/>
+          <w:b w:val="0"/>
+          <w:sz w:val="21"/>
+        </w:rPr>
+        <w:t>打包成 zip；</w:t>
       </w:r>
     </w:p>
     <w:p>
@@ -3338,17 +4274,41 @@
           <w:b w:val="0"/>
           <w:sz w:val="21"/>
         </w:rPr>
-        <w:t>日志里**不含**密钥和绝对路径，可以放心发。</w:t>
+        <w:t>日志里</w:t>
+      </w:r>
+      <w:r>
+        <w:rPr>
+          <w:rFonts w:ascii="Times New Roman" w:hAnsi="Times New Roman" w:eastAsia="宋体"/>
+          <w:b/>
+          <w:sz w:val="21"/>
+        </w:rPr>
+        <w:t>不含</w:t>
+      </w:r>
+      <w:r>
+        <w:rPr>
+          <w:rFonts w:ascii="Times New Roman" w:hAnsi="Times New Roman" w:eastAsia="宋体"/>
+          <w:b w:val="0"/>
+          <w:sz w:val="21"/>
+        </w:rPr>
+        <w:t>密钥和绝对路径，可以放心发。</w:t>
       </w:r>
     </w:p>
     <w:p>
       <w:r>
         <w:rPr>
           <w:rFonts w:ascii="Times New Roman" w:hAnsi="Times New Roman" w:eastAsia="宋体"/>
+          <w:b/>
+          <w:sz w:val="21"/>
+        </w:rPr>
+        <w:t>联系方式</w:t>
+      </w:r>
+      <w:r>
+        <w:rPr>
+          <w:rFonts w:ascii="Times New Roman" w:hAnsi="Times New Roman" w:eastAsia="宋体"/>
           <w:b w:val="0"/>
           <w:sz w:val="21"/>
         </w:rPr>
-        <w:t>**联系方式**：QQ 1241640869 · 微信 AluneOfficial · 邮箱 1241640869@qq.com</w:t>
+        <w:t>：QQ 1241640869 · 微信 AluneOfficial · 邮箱 1241640869@qq.com</w:t>
       </w:r>
     </w:p>
     <w:p>
@@ -3546,7 +4506,23 @@
                 <w:b w:val="0"/>
                 <w:sz w:val="19"/>
               </w:rPr>
-              <w:t>不会。只在你点生成时发给**你自己配置**的接口</w:t>
+              <w:t>不会。只在你点生成时发给</w:t>
+            </w:r>
+            <w:r>
+              <w:rPr>
+                <w:rFonts w:ascii="Times New Roman" w:hAnsi="Times New Roman" w:eastAsia="宋体"/>
+                <w:b/>
+                <w:sz w:val="19"/>
+              </w:rPr>
+              <w:t>你自己配置</w:t>
+            </w:r>
+            <w:r>
+              <w:rPr>
+                <w:rFonts w:ascii="Times New Roman" w:hAnsi="Times New Roman" w:eastAsia="宋体"/>
+                <w:b w:val="0"/>
+                <w:sz w:val="19"/>
+              </w:rPr>
+              <w:t>的接口</w:t>
             </w:r>
           </w:p>
         </w:tc>
@@ -3580,7 +4556,15 @@
                 <w:b w:val="0"/>
                 <w:sz w:val="19"/>
               </w:rPr>
-              <w:t>拷整个 `%APPDATA%\xiaofeiyu-physics-animation\data\`</w:t>
+              <w:t xml:space="preserve">拷整个 </w:t>
+            </w:r>
+            <w:r>
+              <w:rPr>
+                <w:rFonts w:ascii="Courier New" w:hAnsi="Courier New" w:eastAsia="宋体"/>
+                <w:b w:val="0"/>
+                <w:sz w:val="19"/>
+              </w:rPr>
+              <w:t>%APPDATA%\xiaofeiyu-physics-animation\data\</w:t>
             </w:r>
           </w:p>
         </w:tc>
@@ -3795,10 +4779,10 @@
       <w:r>
         <w:rPr>
           <w:rFonts w:ascii="Times New Roman" w:hAnsi="Times New Roman" w:eastAsia="宋体"/>
-          <w:b w:val="0"/>
+          <w:b/>
           <w:sz w:val="21"/>
         </w:rPr>
-        <w:t>**你导出的动画：归你，包括商用**</w:t>
+        <w:t>你导出的动画：归你，包括商用</w:t>
       </w:r>
     </w:p>
     <w:p>
@@ -3808,7 +4792,55 @@
           <w:b w:val="0"/>
           <w:sz w:val="21"/>
         </w:rPr>
-        <w:t>个人使用、教学、学校内部使用都免费。完整声明见软件文件夹里的 `LICENSE`、`NOTICE`、`LICENSE-DOCS`。</w:t>
+        <w:t xml:space="preserve">个人使用、教学、学校内部使用都免费。完整声明见软件文件夹里的 </w:t>
+      </w:r>
+      <w:r>
+        <w:rPr>
+          <w:rFonts w:ascii="Courier New" w:hAnsi="Courier New" w:eastAsia="宋体"/>
+          <w:b w:val="0"/>
+          <w:sz w:val="21"/>
+        </w:rPr>
+        <w:t>LICENSE</w:t>
+      </w:r>
+      <w:r>
+        <w:rPr>
+          <w:rFonts w:ascii="Times New Roman" w:hAnsi="Times New Roman" w:eastAsia="宋体"/>
+          <w:b w:val="0"/>
+          <w:sz w:val="21"/>
+        </w:rPr>
+        <w:t>、</w:t>
+      </w:r>
+      <w:r>
+        <w:rPr>
+          <w:rFonts w:ascii="Courier New" w:hAnsi="Courier New" w:eastAsia="宋体"/>
+          <w:b w:val="0"/>
+          <w:sz w:val="21"/>
+        </w:rPr>
+        <w:t>NOTICE</w:t>
+      </w:r>
+      <w:r>
+        <w:rPr>
+          <w:rFonts w:ascii="Times New Roman" w:hAnsi="Times New Roman" w:eastAsia="宋体"/>
+          <w:b w:val="0"/>
+          <w:sz w:val="21"/>
+        </w:rPr>
+        <w:t>、</w:t>
+      </w:r>
+      <w:r>
+        <w:rPr>
+          <w:rFonts w:ascii="Courier New" w:hAnsi="Courier New" w:eastAsia="宋体"/>
+          <w:b w:val="0"/>
+          <w:sz w:val="21"/>
+        </w:rPr>
+        <w:t>LICENSE-DOCS</w:t>
+      </w:r>
+      <w:r>
+        <w:rPr>
+          <w:rFonts w:ascii="Times New Roman" w:hAnsi="Times New Roman" w:eastAsia="宋体"/>
+          <w:b w:val="0"/>
+          <w:sz w:val="21"/>
+        </w:rPr>
+        <w:t>。</w:t>
       </w:r>
     </w:p>
     <w:sectPr>

</xml_diff>